<commit_message>
docs: update mentor Dr. M. Geetha and team member Sriman Kumar V across template PDF and DOCX files
</commit_message>
<xml_diff>
--- a/MEMOMATE_SIH_2026_DOCUMENTATION.docx
+++ b/MEMOMATE_SIH_2026_DOCUMENTATION.docx
@@ -323,6 +323,108 @@
                 <w:sz w:val="24"/>
               </w:rPr>
               <w:t>Department of Computer Science and Engineering</w:t>
+            </w:r>
+          </w:p>
+        </w:tc>
+      </w:tr>
+      <w:tr>
+        <w:tc>
+          <w:tcPr>
+            <w:tcW w:type="dxa" w:w="3168"/>
+            <w:shd w:val="clear" w:color="auto" w:fill="F2F4F7"/>
+            <w:tcMar>
+              <w:top w:w="80" w:type="dxa"/>
+              <w:bottom w:w="80" w:type="dxa"/>
+              <w:left w:w="100" w:type="dxa"/>
+              <w:right w:w="100" w:type="dxa"/>
+            </w:tcMar>
+          </w:tcPr>
+          <w:p>
+            <w:pPr>
+              <w:jc w:val="left"/>
+            </w:pPr>
+            <w:r>
+              <w:rPr>
+                <w:rFonts w:ascii="Times New Roman" w:hAnsi="Times New Roman"/>
+                <w:b/>
+                <w:sz w:val="24"/>
+              </w:rPr>
+              <w:t>Team Member(s):</w:t>
+            </w:r>
+          </w:p>
+        </w:tc>
+        <w:tc>
+          <w:tcPr>
+            <w:tcW w:type="dxa" w:w="5760"/>
+            <w:shd w:val="clear" w:color="auto" w:fill="FFFFFF"/>
+            <w:tcMar>
+              <w:top w:w="80" w:type="dxa"/>
+              <w:bottom w:w="80" w:type="dxa"/>
+              <w:left w:w="100" w:type="dxa"/>
+              <w:right w:w="100" w:type="dxa"/>
+            </w:tcMar>
+          </w:tcPr>
+          <w:p>
+            <w:pPr>
+              <w:jc w:val="left"/>
+            </w:pPr>
+            <w:r>
+              <w:rPr>
+                <w:rFonts w:ascii="Times New Roman" w:hAnsi="Times New Roman"/>
+                <w:sz w:val="24"/>
+              </w:rPr>
+              <w:t>Sriman Kumar V (24CSR301) &amp; Srimathi D</w:t>
+            </w:r>
+          </w:p>
+        </w:tc>
+      </w:tr>
+      <w:tr>
+        <w:tc>
+          <w:tcPr>
+            <w:tcW w:type="dxa" w:w="3168"/>
+            <w:shd w:val="clear" w:color="auto" w:fill="F2F4F7"/>
+            <w:tcMar>
+              <w:top w:w="80" w:type="dxa"/>
+              <w:bottom w:w="80" w:type="dxa"/>
+              <w:left w:w="100" w:type="dxa"/>
+              <w:right w:w="100" w:type="dxa"/>
+            </w:tcMar>
+          </w:tcPr>
+          <w:p>
+            <w:pPr>
+              <w:jc w:val="left"/>
+            </w:pPr>
+            <w:r>
+              <w:rPr>
+                <w:rFonts w:ascii="Times New Roman" w:hAnsi="Times New Roman"/>
+                <w:b/>
+                <w:sz w:val="24"/>
+              </w:rPr>
+              <w:t>Faculty Mentor:</w:t>
+            </w:r>
+          </w:p>
+        </w:tc>
+        <w:tc>
+          <w:tcPr>
+            <w:tcW w:type="dxa" w:w="5760"/>
+            <w:shd w:val="clear" w:color="auto" w:fill="FFFFFF"/>
+            <w:tcMar>
+              <w:top w:w="80" w:type="dxa"/>
+              <w:bottom w:w="80" w:type="dxa"/>
+              <w:left w:w="100" w:type="dxa"/>
+              <w:right w:w="100" w:type="dxa"/>
+            </w:tcMar>
+          </w:tcPr>
+          <w:p>
+            <w:pPr>
+              <w:jc w:val="left"/>
+            </w:pPr>
+            <w:r>
+              <w:rPr>
+                <w:rFonts w:ascii="Times New Roman" w:hAnsi="Times New Roman"/>
+                <w:sz w:val="24"/>
+              </w:rPr>
+              <w:t>Dr. M. Geetha M.E., Ph.D., Associate Professor, CSE</w:t>
             </w:r>
           </w:p>
         </w:tc>

</xml_diff>